<commit_message>
Fit letter to the Principal on one page
Co-Authored-By: Claude Opus 5.5 <noreply@anthropic.com>
Claude-Session: https://claude.ai/code/session_01CfJTMfXFc82rJfpUEhFbWM
</commit_message>
<xml_diff>
--- a/letters/Letter_to_Principal_Rohit_Pujari.docx
+++ b/letters/Letter_to_Principal_Rohit_Pujari.docx
@@ -349,12 +349,6 @@
         <w:spacing w:after="0"/>
         <w:jc w:val="left"/>
       </w:pPr>
-    </w:p>
-    <w:p>
-      <w:pPr>
-        <w:spacing w:after="0"/>
-        <w:jc w:val="left"/>
-      </w:pPr>
       <w:r>
         <w:rPr>
           <w:b w:val="0"/>
@@ -388,7 +382,7 @@
     </w:p>
     <w:sectPr>
       <w:pgSz w:w="11909" w:h="16834"/>
-      <w:pgMar w:top="1152" w:right="1296" w:bottom="1152" w:left="1296" w:header="720" w:footer="720" w:gutter="0"/>
+      <w:pgMar w:top="864" w:right="1296" w:bottom="864" w:left="1296" w:header="720" w:footer="720" w:gutter="0"/>
       <w:cols w:space="720"/>
       <w:docGrid w:linePitch="360"/>
     </w:sectPr>
@@ -760,11 +754,11 @@
     <w:qFormat/>
     <w:rsid w:val="00FC693F"/>
     <w:pPr>
-      <w:spacing w:after="0" w:line="264" w:lineRule="auto"/>
+      <w:spacing w:after="0" w:line="240" w:lineRule="auto"/>
     </w:pPr>
     <w:rPr>
       <w:rFonts w:ascii="Times New Roman" w:hAnsi="Times New Roman" w:eastAsia="Times New Roman"/>
-      <w:sz w:val="24"/>
+      <w:sz w:val="23"/>
     </w:rPr>
   </w:style>
   <w:style w:type="paragraph" w:styleId="Header">

</xml_diff>

<commit_message>
Reword letter: management-led centre headed by an industry expert, not a student startup
Co-Authored-By: Claude Opus 5.5 <noreply@anthropic.com>
Claude-Session: https://claude.ai/code/session_01CfJTMfXFc82rJfpUEhFbWM
</commit_message>
<xml_diff>
--- a/letters/Letter_to_Principal_Rohit_Pujari.docx
+++ b/letters/Letter_to_Principal_Rohit_Pujari.docx
@@ -179,19 +179,31 @@
         <w:rPr>
           <w:b w:val="0"/>
         </w:rPr>
-        <w:t xml:space="preserve">In the same way, our college can start an </w:t>
+        <w:t xml:space="preserve">In the same way, I request that the </w:t>
       </w:r>
       <w:r>
         <w:rPr>
           <w:b/>
         </w:rPr>
-        <w:t>in-house Product Development Centre</w:t>
+        <w:t>college management</w:t>
       </w:r>
       <w:r>
         <w:rPr>
           <w:b w:val="0"/>
         </w:rPr>
-        <w:t xml:space="preserve"> that works like a small software company on campus. It can build real products, such as the college's own attendance, library or event management systems, and later websites and apps for local businesses and organisations. The centre can hire our brilliant students and fresh graduates who are genuinely interested in building products. Students who get offers from good outside companies should be free to join them; the centre only needs those who want to work on its products.</w:t>
+        <w:t xml:space="preserve"> set up a </w:t>
+      </w:r>
+      <w:r>
+        <w:rPr>
+          <w:b/>
+        </w:rPr>
+        <w:t>Product Development Centre</w:t>
+      </w:r>
+      <w:r>
+        <w:rPr>
+          <w:b w:val="0"/>
+        </w:rPr>
+        <w:t xml:space="preserve"> on our campus. This is not a student startup. The management can bring in a reputed and experienced person from the software industry, or partner with an established company, to lead the centre and build real products, for example the college's own attendance, library and event systems, and later projects for outside organisations. The centre can then take our students as interns and hire brilliant students and fresh graduates who are interested in this work. Students who get offers from good outside companies should be free to join them; the centre only needs those who want to work on its products.</w:t>
       </w:r>
     </w:p>
     <w:p>
@@ -281,7 +293,7 @@
         <w:rPr>
           <w:b w:val="0"/>
         </w:rPr>
-        <w:t>•  Senior students and graduates can guide juniors, so the work continues every year.</w:t>
+        <w:t>•  Students learn directly from an experienced industry professional.</w:t>
       </w:r>
     </w:p>
     <w:p>
@@ -299,7 +311,7 @@
         <w:rPr>
           <w:b w:val="0"/>
         </w:rPr>
-        <w:t>To begin, the centre can be started on a small scale as a pilot, with 5 to 10 students under faculty mentors in one laboratory, and its first product can be a software solution needed by our own college. It can also work together with the college's innovation or incubation cell, if one exists.</w:t>
+        <w:t>To begin, the management can appoint the industry expert as head of the centre, give it one laboratory, and start with a small team of students under that person and our faculty. Its first product can be a software solution needed by our own college.</w:t>
       </w:r>
     </w:p>
     <w:p>

</xml_diff>